<commit_message>
Replace Reflection.docx with Reflection.docx
</commit_message>
<xml_diff>
--- a/files/REFLECTION/Reflection.docx
+++ b/files/REFLECTION/Reflection.docx
@@ -1,46 +1,178 @@
 
 <file path=word/document.xml><?xml version="1.0" encoding="utf-8"?>
-<w:document xmlns:wpc="http://schemas.microsoft.com/office/word/2010/wordprocessingCanvas" xmlns:cx="http://schemas.microsoft.com/office/drawing/2014/chartex" xmlns:cx1="http://schemas.microsoft.com/office/drawing/2015/9/8/chartex" xmlns:cx2="http://schemas.microsoft.com/office/drawing/2015/10/21/chartex" xmlns:cx3="http://schemas.microsoft.com/office/drawing/2016/5/9/chartex" xmlns:cx4="http://schemas.microsoft.com/office/drawing/2016/5/10/chartex" xmlns:cx5="http://schemas.microsoft.com/office/drawing/2016/5/11/chartex" xmlns:cx6="http://schemas.microsoft.com/office/drawing/2016/5/12/chartex" xmlns:cx7="http://schemas.microsoft.com/office/drawing/2016/5/13/chartex" xmlns:cx8="http://schemas.microsoft.com/office/drawing/2016/5/14/chartex" xmlns:mc="http://schemas.openxmlformats.org/markup-compatibility/2006" xmlns:aink="http://schemas.microsoft.com/office/drawing/2016/ink" xmlns:am3d="http://schemas.microsoft.com/office/drawing/2017/model3d" xmlns:o="urn:schemas-microsoft-com:office:office" xmlns:oel="http://schemas.microsoft.com/office/2019/extlst" xmlns:r="http://schemas.openxmlformats.org/officeDocument/2006/relationships" xmlns:m="http://schemas.openxmlformats.org/officeDocument/2006/math" xmlns:v="urn:schemas-microsoft-com:vml" xmlns:wp14="http://schemas.microsoft.com/office/word/2010/wordprocessingDrawing" xmlns:wp="http://schemas.openxmlformats.org/drawingml/2006/wordprocessingDrawing" xmlns:w10="urn:schemas-microsoft-com:office:word" xmlns:w="http://schemas.openxmlformats.org/wordprocessingml/2006/main" xmlns:w14="http://schemas.microsoft.com/office/word/2010/wordml" xmlns:w15="http://schemas.microsoft.com/office/word/2012/wordml" xmlns:w16cex="http://schemas.microsoft.com/office/word/2018/wordml/cex" xmlns:w16cid="http://schemas.microsoft.com/office/word/2016/wordml/cid" xmlns:w16="http://schemas.microsoft.com/office/word/2018/wordml" xmlns:w16du="http://schemas.microsoft.com/office/word/2023/wordml/word16du" xmlns:w16sdtdh="http://schemas.microsoft.com/office/word/2020/wordml/sdtdatahash" xmlns:w16sdtfl="http://schemas.microsoft.com/office/word/2024/wordml/sdtformatlock" xmlns:w16se="http://schemas.microsoft.com/office/word/2015/wordml/symex" xmlns:wpg="http://schemas.microsoft.com/office/word/2010/wordprocessingGroup" xmlns:wpi="http://schemas.microsoft.com/office/word/2010/wordprocessingInk" xmlns:wne="http://schemas.microsoft.com/office/word/2006/wordml" xmlns:wps="http://schemas.microsoft.com/office/word/2010/wordprocessingShape" mc:Ignorable="w14 w15 w16se w16cid w16 w16cex w16sdtdh w16sdtfl w16du wp14">
+<w:document xmlns:wpc="http://schemas.microsoft.com/office/word/2010/wordprocessingCanvas" xmlns:cx="http://schemas.microsoft.com/office/drawing/2014/chartex" xmlns:cx1="http://schemas.microsoft.com/office/drawing/2015/9/8/chartex" xmlns:cx2="http://schemas.microsoft.com/office/drawing/2015/10/21/chartex" xmlns:cx3="http://schemas.microsoft.com/office/drawing/2016/5/9/chartex" xmlns:cx4="http://schemas.microsoft.com/office/drawing/2016/5/10/chartex" xmlns:cx5="http://schemas.microsoft.com/office/drawing/2016/5/11/chartex" xmlns:cx6="http://schemas.microsoft.com/office/drawing/2016/5/12/chartex" xmlns:cx7="http://schemas.microsoft.com/office/drawing/2016/5/13/chartex" xmlns:cx8="http://schemas.microsoft.com/office/drawing/2016/5/14/chartex" xmlns:mc="http://schemas.openxmlformats.org/markup-compatibility/2006" xmlns:m="http://schemas.openxmlformats.org/officeDocument/2006/math" xmlns:aink="http://schemas.microsoft.com/office/drawing/2016/ink" xmlns:am3d="http://schemas.microsoft.com/office/drawing/2017/model3d" xmlns:oel="http://schemas.microsoft.com/office/2019/extlst" xmlns:r="http://schemas.openxmlformats.org/officeDocument/2006/relationships" xmlns:wp14="http://schemas.microsoft.com/office/word/2010/wordprocessingDrawing" xmlns:wp="http://schemas.openxmlformats.org/drawingml/2006/wordprocessingDrawing" xmlns:wpg="http://schemas.microsoft.com/office/word/2010/wordprocessingGroup" xmlns:wpi="http://schemas.microsoft.com/office/word/2010/wordprocessingInk" xmlns:wps="http://schemas.microsoft.com/office/word/2010/wordprocessingShape" xmlns:o="urn:schemas-microsoft-com:office:office" xmlns:v="urn:schemas-microsoft-com:vml" xmlns:w10="urn:schemas-microsoft-com:office:word" xmlns:w="http://schemas.openxmlformats.org/wordprocessingml/2006/main" xmlns:w14="http://schemas.microsoft.com/office/word/2010/wordml" xmlns:w15="http://schemas.microsoft.com/office/word/2012/wordml" xmlns:w16cex="http://schemas.microsoft.com/office/word/2018/wordml/cex" xmlns:w16cid="http://schemas.microsoft.com/office/word/2016/wordml/cid" xmlns:w16="http://schemas.microsoft.com/office/word/2018/wordml" xmlns:w16sdtdh="http://schemas.microsoft.com/office/word/2020/wordml/sdtdatahash" xmlns:w16sdtfl="http://schemas.microsoft.com/office/word/2024/wordml/sdtformatlock" xmlns:w16se="http://schemas.microsoft.com/office/word/2015/wordml/symex" xmlns:w16du="http://schemas.microsoft.com/office/word/2023/wordml/word16du" xmlns:wne="http://schemas.microsoft.com/office/word/2006/wordml" mc:Ignorable="w14 w15 w16se w16cid w16 w16cex w16sdtdh w16sdtfl w16du wp14">
   <w:body>
     <w:p>
-      <w:r>
-        <w:t xml:space="preserve">     Technology integration in education is often understood as simply using computers, gadgets, and online applications during classroom discussions. However, technology integration goes beyond the use of digital tools. It involves selecting and applying appropriate technologies to make teaching more effective, meaningful, and accessible to learners.</w:t>
-      </w:r>
-    </w:p>
-    <w:p/>
-    <w:p>
-      <w:r>
-        <w:t xml:space="preserve">     Understanding the different foundational terms in technology provides a broader perspective on how technology supports education. Each concept serves a different purpose, from communicating information and delivering instruction to providing learning resources and improving students’ understanding. It also emphasizes that effective learning does not always require advanced devices or an internet connection. Even simple technological resources can contribute to meaningful learning when used appropriately.</w:t>
-      </w:r>
-    </w:p>
-    <w:p/>
-    <w:p>
-      <w:r>
-        <w:t xml:space="preserve">     In mathematics education, technology can help students understand abstract concepts through visual representations, interactive activities, and practical applications. However, the effectiveness of technology depends on how well it supports the learning objectives and addresses students’ needs. Teachers must carefully choose tools that encourage participation, understanding, and critical thinking rather than simply making lessons more entertaining.</w:t>
-      </w:r>
-    </w:p>
-    <w:p/>
-    <w:p>
-      <w:r>
-        <w:t xml:space="preserve">     </w:t>
-      </w:r>
-      <w:r>
-        <w:t>Overall, technology integration is not about using the most advanced tools but about using available resources with purpose and creativity to create meaningful learning experiences.</w:t>
-      </w:r>
-    </w:p>
-    <w:p/>
+      <w:pPr>
+        <w:spacing w:after="0" w:line="259" w:lineRule="auto"/>
+        <w:ind w:left="990" w:firstLine="0"/>
+        <w:jc w:val="left"/>
+      </w:pPr>
+      <w:r>
+        <w:rPr>
+          <w:noProof/>
+        </w:rPr>
+        <w:drawing>
+          <wp:inline distT="0" distB="0" distL="0" distR="0" wp14:anchorId="0ACA9A25" wp14:editId="19883EEE">
+            <wp:extent cx="4686300" cy="1074420"/>
+            <wp:effectExtent l="0" t="0" r="0" b="0"/>
+            <wp:docPr id="107" name="Picture 107"/>
+            <wp:cNvGraphicFramePr/>
+            <a:graphic xmlns:a="http://schemas.openxmlformats.org/drawingml/2006/main">
+              <a:graphicData uri="http://schemas.openxmlformats.org/drawingml/2006/picture">
+                <pic:pic xmlns:pic="http://schemas.openxmlformats.org/drawingml/2006/picture">
+                  <pic:nvPicPr>
+                    <pic:cNvPr id="107" name="Picture 107"/>
+                    <pic:cNvPicPr/>
+                  </pic:nvPicPr>
+                  <pic:blipFill>
+                    <a:blip r:embed="rId4"/>
+                    <a:stretch>
+                      <a:fillRect/>
+                    </a:stretch>
+                  </pic:blipFill>
+                  <pic:spPr>
+                    <a:xfrm>
+                      <a:off x="0" y="0"/>
+                      <a:ext cx="4686300" cy="1074420"/>
+                    </a:xfrm>
+                    <a:prstGeom prst="rect">
+                      <a:avLst/>
+                    </a:prstGeom>
+                  </pic:spPr>
+                </pic:pic>
+              </a:graphicData>
+            </a:graphic>
+          </wp:inline>
+        </w:drawing>
+      </w:r>
+    </w:p>
+    <w:p>
+      <w:pPr>
+        <w:spacing w:after="0" w:line="259" w:lineRule="auto"/>
+        <w:ind w:left="0" w:right="984" w:firstLine="0"/>
+        <w:jc w:val="left"/>
+      </w:pPr>
+      <w:r>
+        <w:t xml:space="preserve"> </w:t>
+      </w:r>
+      <w:r>
+        <w:tab/>
+        <w:t xml:space="preserve"> </w:t>
+      </w:r>
+    </w:p>
+    <w:p>
+      <w:pPr>
+        <w:spacing w:after="0" w:line="259" w:lineRule="auto"/>
+        <w:ind w:left="0" w:firstLine="0"/>
+        <w:jc w:val="left"/>
+      </w:pPr>
+      <w:r>
+        <w:t xml:space="preserve"> </w:t>
+      </w:r>
+    </w:p>
+    <w:p>
+      <w:pPr>
+        <w:spacing w:after="0"/>
+        <w:ind w:left="-5" w:right="-13"/>
+      </w:pPr>
+      <w:r>
+        <w:t xml:space="preserve">       </w:t>
+      </w:r>
+      <w:r>
+        <w:t xml:space="preserve">Technology integration in education is often understood as simply using computers, gadgets, and online applications during classroom discussions. However, technology integration goes beyond the use of digital tools. It involves selecting and applying appropriate technologies to make teaching more effective, meaningful, and accessible to learners. </w:t>
+      </w:r>
+    </w:p>
+    <w:p>
+      <w:pPr>
+        <w:spacing w:after="181" w:line="259" w:lineRule="auto"/>
+        <w:ind w:left="0" w:firstLine="0"/>
+        <w:jc w:val="left"/>
+      </w:pPr>
+      <w:r>
+        <w:t xml:space="preserve"> </w:t>
+      </w:r>
+    </w:p>
+    <w:p>
+      <w:pPr>
+        <w:ind w:left="-5" w:right="-13"/>
+      </w:pPr>
+      <w:r>
+        <w:t xml:space="preserve"> </w:t>
+      </w:r>
+      <w:r>
+        <w:t xml:space="preserve">       </w:t>
+      </w:r>
+      <w:r>
+        <w:t xml:space="preserve">Understanding the different foundational terms in technology provides a broader perspective on how technology supports education. Each concept serves a different purpose, from communicating information and delivering instruction to providing learning resources and improving students’ understanding. It also emphasizes that effective learning does not always require advanced devices or an internet connection. Even simple technological resources can contribute to meaningful learning when used appropriately. </w:t>
+      </w:r>
+    </w:p>
+    <w:p>
+      <w:pPr>
+        <w:spacing w:after="181" w:line="259" w:lineRule="auto"/>
+        <w:ind w:left="0" w:firstLine="0"/>
+        <w:jc w:val="left"/>
+      </w:pPr>
+      <w:r>
+        <w:t xml:space="preserve"> </w:t>
+      </w:r>
+    </w:p>
+    <w:p>
+      <w:pPr>
+        <w:ind w:left="-5" w:right="-13"/>
+      </w:pPr>
+      <w:r>
+        <w:t xml:space="preserve"> </w:t>
+      </w:r>
+      <w:r>
+        <w:t xml:space="preserve">       </w:t>
+      </w:r>
+      <w:r>
+        <w:t xml:space="preserve">In mathematics education, technology can help students understand abstract concepts through visual representations, interactive activities, and practical applications. However, the effectiveness of technology depends on how well it supports the learning objectives and addresses students’ needs. Teachers must carefully choose tools that encourage participation, understanding, and critical thinking rather than simply making lessons more entertaining. </w:t>
+      </w:r>
+    </w:p>
+    <w:p>
+      <w:pPr>
+        <w:spacing w:after="181" w:line="259" w:lineRule="auto"/>
+        <w:ind w:left="0" w:firstLine="0"/>
+        <w:jc w:val="left"/>
+      </w:pPr>
+      <w:r>
+        <w:t xml:space="preserve"> </w:t>
+      </w:r>
+    </w:p>
+    <w:p>
+      <w:pPr>
+        <w:ind w:right="-13"/>
+      </w:pPr>
+      <w:r>
+        <w:t xml:space="preserve">       </w:t>
+      </w:r>
+      <w:r>
+        <w:t xml:space="preserve">Overall, technology integration is not about using the most advanced tools but about using available resources with purpose and creativity to create meaningful learning experiences. </w:t>
+      </w:r>
+    </w:p>
+    <w:p>
+      <w:pPr>
+        <w:spacing w:after="0" w:line="259" w:lineRule="auto"/>
+        <w:ind w:left="0" w:firstLine="0"/>
+        <w:jc w:val="left"/>
+      </w:pPr>
+      <w:r>
+        <w:t xml:space="preserve"> </w:t>
+      </w:r>
+    </w:p>
     <w:sectPr>
       <w:pgSz w:w="12240" w:h="15840"/>
-      <w:pgMar w:top="1440" w:right="1440" w:bottom="1440" w:left="1440" w:header="708" w:footer="708" w:gutter="0"/>
-      <w:cols w:space="708"/>
-      <w:docGrid w:linePitch="360"/>
+      <w:pgMar w:top="468" w:right="1446" w:bottom="1440" w:left="1441" w:header="720" w:footer="720" w:gutter="0"/>
+      <w:cols w:space="720"/>
     </w:sectPr>
   </w:body>
 </w:document>
 </file>
 
 <file path=word/styles.xml><?xml version="1.0" encoding="utf-8"?>
-<w:styles xmlns:mc="http://schemas.openxmlformats.org/markup-compatibility/2006" xmlns:r="http://schemas.openxmlformats.org/officeDocument/2006/relationships" xmlns:w="http://schemas.openxmlformats.org/wordprocessingml/2006/main" xmlns:w14="http://schemas.microsoft.com/office/word/2010/wordml" xmlns:w15="http://schemas.microsoft.com/office/word/2012/wordml" xmlns:w16cex="http://schemas.microsoft.com/office/word/2018/wordml/cex" xmlns:w16cid="http://schemas.microsoft.com/office/word/2016/wordml/cid" xmlns:w16="http://schemas.microsoft.com/office/word/2018/wordml" xmlns:w16du="http://schemas.microsoft.com/office/word/2023/wordml/word16du" xmlns:w16sdtdh="http://schemas.microsoft.com/office/word/2020/wordml/sdtdatahash" xmlns:w16sdtfl="http://schemas.microsoft.com/office/word/2024/wordml/sdtformatlock" xmlns:w16se="http://schemas.microsoft.com/office/word/2015/wordml/symex" mc:Ignorable="w14 w15 w16se w16cid w16 w16cex w16sdtdh w16sdtfl w16du">
+<w:styles xmlns:mc="http://schemas.openxmlformats.org/markup-compatibility/2006" xmlns:r="http://schemas.openxmlformats.org/officeDocument/2006/relationships" xmlns:w="http://schemas.openxmlformats.org/wordprocessingml/2006/main" xmlns:w14="http://schemas.microsoft.com/office/word/2010/wordml" xmlns:w15="http://schemas.microsoft.com/office/word/2012/wordml" xmlns:w16cex="http://schemas.microsoft.com/office/word/2018/wordml/cex" xmlns:w16cid="http://schemas.microsoft.com/office/word/2016/wordml/cid" xmlns:w16="http://schemas.microsoft.com/office/word/2018/wordml" xmlns:w16sdtdh="http://schemas.microsoft.com/office/word/2020/wordml/sdtdatahash" xmlns:w16sdtfl="http://schemas.microsoft.com/office/word/2024/wordml/sdtformatlock" xmlns:w16se="http://schemas.microsoft.com/office/word/2015/wordml/symex" xmlns:w16du="http://schemas.microsoft.com/office/word/2023/wordml/word16du" mc:Ignorable="w14 w15 w16se w16cid w16 w16cex w16sdtdh w16sdtfl w16du">
   <w:docDefaults>
     <w:rPrDefault>
       <w:rPr>
@@ -48,7 +180,7 @@
         <w:kern w:val="2"/>
         <w:sz w:val="24"/>
         <w:szCs w:val="24"/>
-        <w:lang w:val="en-GB" w:eastAsia="en-US" w:bidi="ar-SA"/>
+        <w:lang w:val="en-US" w:eastAsia="en-US" w:bidi="ar-SA"/>
         <w14:ligatures w14:val="standardContextual"/>
       </w:rPr>
     </w:rPrDefault>
@@ -439,204 +571,15 @@
   <w:style w:type="paragraph" w:default="1" w:styleId="Normal">
     <w:name w:val="Normal"/>
     <w:qFormat/>
-  </w:style>
-  <w:style w:type="paragraph" w:styleId="Heading1">
-    <w:name w:val="heading 1"/>
-    <w:basedOn w:val="Normal"/>
-    <w:next w:val="Normal"/>
-    <w:link w:val="Heading1Char"/>
-    <w:uiPriority w:val="9"/>
-    <w:qFormat/>
-    <w:rsid w:val="00DF7198"/>
     <w:pPr>
-      <w:keepNext/>
-      <w:keepLines/>
-      <w:spacing w:before="360" w:after="80"/>
-      <w:outlineLvl w:val="0"/>
+      <w:spacing w:after="161" w:line="276" w:lineRule="auto"/>
+      <w:ind w:left="10" w:hanging="10"/>
+      <w:jc w:val="both"/>
     </w:pPr>
     <w:rPr>
-      <w:rFonts w:asciiTheme="majorHAnsi" w:eastAsiaTheme="majorEastAsia" w:hAnsiTheme="majorHAnsi" w:cstheme="majorBidi"/>
-      <w:color w:val="0F4761" w:themeColor="accent1" w:themeShade="BF"/>
-      <w:sz w:val="40"/>
-      <w:szCs w:val="40"/>
-    </w:rPr>
-  </w:style>
-  <w:style w:type="paragraph" w:styleId="Heading2">
-    <w:name w:val="heading 2"/>
-    <w:basedOn w:val="Normal"/>
-    <w:next w:val="Normal"/>
-    <w:link w:val="Heading2Char"/>
-    <w:uiPriority w:val="9"/>
-    <w:semiHidden/>
-    <w:unhideWhenUsed/>
-    <w:qFormat/>
-    <w:rsid w:val="00DF7198"/>
-    <w:pPr>
-      <w:keepNext/>
-      <w:keepLines/>
-      <w:spacing w:before="160" w:after="80"/>
-      <w:outlineLvl w:val="1"/>
-    </w:pPr>
-    <w:rPr>
-      <w:rFonts w:asciiTheme="majorHAnsi" w:eastAsiaTheme="majorEastAsia" w:hAnsiTheme="majorHAnsi" w:cstheme="majorBidi"/>
-      <w:color w:val="0F4761" w:themeColor="accent1" w:themeShade="BF"/>
-      <w:sz w:val="32"/>
-      <w:szCs w:val="32"/>
-    </w:rPr>
-  </w:style>
-  <w:style w:type="paragraph" w:styleId="Heading3">
-    <w:name w:val="heading 3"/>
-    <w:basedOn w:val="Normal"/>
-    <w:next w:val="Normal"/>
-    <w:link w:val="Heading3Char"/>
-    <w:uiPriority w:val="9"/>
-    <w:semiHidden/>
-    <w:unhideWhenUsed/>
-    <w:qFormat/>
-    <w:rsid w:val="00DF7198"/>
-    <w:pPr>
-      <w:keepNext/>
-      <w:keepLines/>
-      <w:spacing w:before="160" w:after="80"/>
-      <w:outlineLvl w:val="2"/>
-    </w:pPr>
-    <w:rPr>
-      <w:rFonts w:eastAsiaTheme="majorEastAsia" w:cstheme="majorBidi"/>
-      <w:color w:val="0F4761" w:themeColor="accent1" w:themeShade="BF"/>
-      <w:sz w:val="28"/>
-      <w:szCs w:val="28"/>
-    </w:rPr>
-  </w:style>
-  <w:style w:type="paragraph" w:styleId="Heading4">
-    <w:name w:val="heading 4"/>
-    <w:basedOn w:val="Normal"/>
-    <w:next w:val="Normal"/>
-    <w:link w:val="Heading4Char"/>
-    <w:uiPriority w:val="9"/>
-    <w:semiHidden/>
-    <w:unhideWhenUsed/>
-    <w:qFormat/>
-    <w:rsid w:val="00DF7198"/>
-    <w:pPr>
-      <w:keepNext/>
-      <w:keepLines/>
-      <w:spacing w:before="80" w:after="40"/>
-      <w:outlineLvl w:val="3"/>
-    </w:pPr>
-    <w:rPr>
-      <w:rFonts w:eastAsiaTheme="majorEastAsia" w:cstheme="majorBidi"/>
-      <w:i/>
-      <w:iCs/>
-      <w:color w:val="0F4761" w:themeColor="accent1" w:themeShade="BF"/>
-    </w:rPr>
-  </w:style>
-  <w:style w:type="paragraph" w:styleId="Heading5">
-    <w:name w:val="heading 5"/>
-    <w:basedOn w:val="Normal"/>
-    <w:next w:val="Normal"/>
-    <w:link w:val="Heading5Char"/>
-    <w:uiPriority w:val="9"/>
-    <w:semiHidden/>
-    <w:unhideWhenUsed/>
-    <w:qFormat/>
-    <w:rsid w:val="00DF7198"/>
-    <w:pPr>
-      <w:keepNext/>
-      <w:keepLines/>
-      <w:spacing w:before="80" w:after="40"/>
-      <w:outlineLvl w:val="4"/>
-    </w:pPr>
-    <w:rPr>
-      <w:rFonts w:eastAsiaTheme="majorEastAsia" w:cstheme="majorBidi"/>
-      <w:color w:val="0F4761" w:themeColor="accent1" w:themeShade="BF"/>
-    </w:rPr>
-  </w:style>
-  <w:style w:type="paragraph" w:styleId="Heading6">
-    <w:name w:val="heading 6"/>
-    <w:basedOn w:val="Normal"/>
-    <w:next w:val="Normal"/>
-    <w:link w:val="Heading6Char"/>
-    <w:uiPriority w:val="9"/>
-    <w:semiHidden/>
-    <w:unhideWhenUsed/>
-    <w:qFormat/>
-    <w:rsid w:val="00DF7198"/>
-    <w:pPr>
-      <w:keepNext/>
-      <w:keepLines/>
-      <w:spacing w:before="40" w:after="0"/>
-      <w:outlineLvl w:val="5"/>
-    </w:pPr>
-    <w:rPr>
-      <w:rFonts w:eastAsiaTheme="majorEastAsia" w:cstheme="majorBidi"/>
-      <w:i/>
-      <w:iCs/>
-      <w:color w:val="595959" w:themeColor="text1" w:themeTint="A6"/>
-    </w:rPr>
-  </w:style>
-  <w:style w:type="paragraph" w:styleId="Heading7">
-    <w:name w:val="heading 7"/>
-    <w:basedOn w:val="Normal"/>
-    <w:next w:val="Normal"/>
-    <w:link w:val="Heading7Char"/>
-    <w:uiPriority w:val="9"/>
-    <w:semiHidden/>
-    <w:unhideWhenUsed/>
-    <w:qFormat/>
-    <w:rsid w:val="00DF7198"/>
-    <w:pPr>
-      <w:keepNext/>
-      <w:keepLines/>
-      <w:spacing w:before="40" w:after="0"/>
-      <w:outlineLvl w:val="6"/>
-    </w:pPr>
-    <w:rPr>
-      <w:rFonts w:eastAsiaTheme="majorEastAsia" w:cstheme="majorBidi"/>
-      <w:color w:val="595959" w:themeColor="text1" w:themeTint="A6"/>
-    </w:rPr>
-  </w:style>
-  <w:style w:type="paragraph" w:styleId="Heading8">
-    <w:name w:val="heading 8"/>
-    <w:basedOn w:val="Normal"/>
-    <w:next w:val="Normal"/>
-    <w:link w:val="Heading8Char"/>
-    <w:uiPriority w:val="9"/>
-    <w:semiHidden/>
-    <w:unhideWhenUsed/>
-    <w:qFormat/>
-    <w:rsid w:val="00DF7198"/>
-    <w:pPr>
-      <w:keepNext/>
-      <w:keepLines/>
-      <w:spacing w:after="0"/>
-      <w:outlineLvl w:val="7"/>
-    </w:pPr>
-    <w:rPr>
-      <w:rFonts w:eastAsiaTheme="majorEastAsia" w:cstheme="majorBidi"/>
-      <w:i/>
-      <w:iCs/>
-      <w:color w:val="272727" w:themeColor="text1" w:themeTint="D8"/>
-    </w:rPr>
-  </w:style>
-  <w:style w:type="paragraph" w:styleId="Heading9">
-    <w:name w:val="heading 9"/>
-    <w:basedOn w:val="Normal"/>
-    <w:next w:val="Normal"/>
-    <w:link w:val="Heading9Char"/>
-    <w:uiPriority w:val="9"/>
-    <w:semiHidden/>
-    <w:unhideWhenUsed/>
-    <w:qFormat/>
-    <w:rsid w:val="00DF7198"/>
-    <w:pPr>
-      <w:keepNext/>
-      <w:keepLines/>
-      <w:spacing w:after="0"/>
-      <w:outlineLvl w:val="8"/>
-    </w:pPr>
-    <w:rPr>
-      <w:rFonts w:eastAsiaTheme="majorEastAsia" w:cstheme="majorBidi"/>
-      <w:color w:val="272727" w:themeColor="text1" w:themeTint="D8"/>
+      <w:rFonts w:ascii="Tahoma" w:eastAsia="Tahoma" w:hAnsi="Tahoma" w:cs="Tahoma"/>
+      <w:color w:val="000000"/>
+      <w:lang w:bidi="en-US"/>
     </w:rPr>
   </w:style>
   <w:style w:type="character" w:default="1" w:styleId="DefaultParagraphFont">
@@ -665,319 +608,6 @@
     <w:uiPriority w:val="99"/>
     <w:semiHidden/>
     <w:unhideWhenUsed/>
-  </w:style>
-  <w:style w:type="character" w:customStyle="1" w:styleId="Heading1Char">
-    <w:name w:val="Heading 1 Char"/>
-    <w:basedOn w:val="DefaultParagraphFont"/>
-    <w:link w:val="Heading1"/>
-    <w:uiPriority w:val="9"/>
-    <w:rsid w:val="00DF7198"/>
-    <w:rPr>
-      <w:rFonts w:asciiTheme="majorHAnsi" w:eastAsiaTheme="majorEastAsia" w:hAnsiTheme="majorHAnsi" w:cstheme="majorBidi"/>
-      <w:color w:val="0F4761" w:themeColor="accent1" w:themeShade="BF"/>
-      <w:sz w:val="40"/>
-      <w:szCs w:val="40"/>
-    </w:rPr>
-  </w:style>
-  <w:style w:type="character" w:customStyle="1" w:styleId="Heading2Char">
-    <w:name w:val="Heading 2 Char"/>
-    <w:basedOn w:val="DefaultParagraphFont"/>
-    <w:link w:val="Heading2"/>
-    <w:uiPriority w:val="9"/>
-    <w:semiHidden/>
-    <w:rsid w:val="00DF7198"/>
-    <w:rPr>
-      <w:rFonts w:asciiTheme="majorHAnsi" w:eastAsiaTheme="majorEastAsia" w:hAnsiTheme="majorHAnsi" w:cstheme="majorBidi"/>
-      <w:color w:val="0F4761" w:themeColor="accent1" w:themeShade="BF"/>
-      <w:sz w:val="32"/>
-      <w:szCs w:val="32"/>
-    </w:rPr>
-  </w:style>
-  <w:style w:type="character" w:customStyle="1" w:styleId="Heading3Char">
-    <w:name w:val="Heading 3 Char"/>
-    <w:basedOn w:val="DefaultParagraphFont"/>
-    <w:link w:val="Heading3"/>
-    <w:uiPriority w:val="9"/>
-    <w:semiHidden/>
-    <w:rsid w:val="00DF7198"/>
-    <w:rPr>
-      <w:rFonts w:eastAsiaTheme="majorEastAsia" w:cstheme="majorBidi"/>
-      <w:color w:val="0F4761" w:themeColor="accent1" w:themeShade="BF"/>
-      <w:sz w:val="28"/>
-      <w:szCs w:val="28"/>
-    </w:rPr>
-  </w:style>
-  <w:style w:type="character" w:customStyle="1" w:styleId="Heading4Char">
-    <w:name w:val="Heading 4 Char"/>
-    <w:basedOn w:val="DefaultParagraphFont"/>
-    <w:link w:val="Heading4"/>
-    <w:uiPriority w:val="9"/>
-    <w:semiHidden/>
-    <w:rsid w:val="00DF7198"/>
-    <w:rPr>
-      <w:rFonts w:eastAsiaTheme="majorEastAsia" w:cstheme="majorBidi"/>
-      <w:i/>
-      <w:iCs/>
-      <w:color w:val="0F4761" w:themeColor="accent1" w:themeShade="BF"/>
-    </w:rPr>
-  </w:style>
-  <w:style w:type="character" w:customStyle="1" w:styleId="Heading5Char">
-    <w:name w:val="Heading 5 Char"/>
-    <w:basedOn w:val="DefaultParagraphFont"/>
-    <w:link w:val="Heading5"/>
-    <w:uiPriority w:val="9"/>
-    <w:semiHidden/>
-    <w:rsid w:val="00DF7198"/>
-    <w:rPr>
-      <w:rFonts w:eastAsiaTheme="majorEastAsia" w:cstheme="majorBidi"/>
-      <w:color w:val="0F4761" w:themeColor="accent1" w:themeShade="BF"/>
-    </w:rPr>
-  </w:style>
-  <w:style w:type="character" w:customStyle="1" w:styleId="Heading6Char">
-    <w:name w:val="Heading 6 Char"/>
-    <w:basedOn w:val="DefaultParagraphFont"/>
-    <w:link w:val="Heading6"/>
-    <w:uiPriority w:val="9"/>
-    <w:semiHidden/>
-    <w:rsid w:val="00DF7198"/>
-    <w:rPr>
-      <w:rFonts w:eastAsiaTheme="majorEastAsia" w:cstheme="majorBidi"/>
-      <w:i/>
-      <w:iCs/>
-      <w:color w:val="595959" w:themeColor="text1" w:themeTint="A6"/>
-    </w:rPr>
-  </w:style>
-  <w:style w:type="character" w:customStyle="1" w:styleId="Heading7Char">
-    <w:name w:val="Heading 7 Char"/>
-    <w:basedOn w:val="DefaultParagraphFont"/>
-    <w:link w:val="Heading7"/>
-    <w:uiPriority w:val="9"/>
-    <w:semiHidden/>
-    <w:rsid w:val="00DF7198"/>
-    <w:rPr>
-      <w:rFonts w:eastAsiaTheme="majorEastAsia" w:cstheme="majorBidi"/>
-      <w:color w:val="595959" w:themeColor="text1" w:themeTint="A6"/>
-    </w:rPr>
-  </w:style>
-  <w:style w:type="character" w:customStyle="1" w:styleId="Heading8Char">
-    <w:name w:val="Heading 8 Char"/>
-    <w:basedOn w:val="DefaultParagraphFont"/>
-    <w:link w:val="Heading8"/>
-    <w:uiPriority w:val="9"/>
-    <w:semiHidden/>
-    <w:rsid w:val="00DF7198"/>
-    <w:rPr>
-      <w:rFonts w:eastAsiaTheme="majorEastAsia" w:cstheme="majorBidi"/>
-      <w:i/>
-      <w:iCs/>
-      <w:color w:val="272727" w:themeColor="text1" w:themeTint="D8"/>
-    </w:rPr>
-  </w:style>
-  <w:style w:type="character" w:customStyle="1" w:styleId="Heading9Char">
-    <w:name w:val="Heading 9 Char"/>
-    <w:basedOn w:val="DefaultParagraphFont"/>
-    <w:link w:val="Heading9"/>
-    <w:uiPriority w:val="9"/>
-    <w:semiHidden/>
-    <w:rsid w:val="00DF7198"/>
-    <w:rPr>
-      <w:rFonts w:eastAsiaTheme="majorEastAsia" w:cstheme="majorBidi"/>
-      <w:color w:val="272727" w:themeColor="text1" w:themeTint="D8"/>
-    </w:rPr>
-  </w:style>
-  <w:style w:type="paragraph" w:styleId="Title">
-    <w:name w:val="Title"/>
-    <w:basedOn w:val="Normal"/>
-    <w:next w:val="Normal"/>
-    <w:link w:val="TitleChar"/>
-    <w:uiPriority w:val="10"/>
-    <w:qFormat/>
-    <w:rsid w:val="00DF7198"/>
-    <w:pPr>
-      <w:spacing w:after="80" w:line="240" w:lineRule="auto"/>
-      <w:contextualSpacing/>
-    </w:pPr>
-    <w:rPr>
-      <w:rFonts w:asciiTheme="majorHAnsi" w:eastAsiaTheme="majorEastAsia" w:hAnsiTheme="majorHAnsi" w:cstheme="majorBidi"/>
-      <w:spacing w:val="-10"/>
-      <w:kern w:val="28"/>
-      <w:sz w:val="56"/>
-      <w:szCs w:val="56"/>
-    </w:rPr>
-  </w:style>
-  <w:style w:type="character" w:customStyle="1" w:styleId="TitleChar">
-    <w:name w:val="Title Char"/>
-    <w:basedOn w:val="DefaultParagraphFont"/>
-    <w:link w:val="Title"/>
-    <w:uiPriority w:val="10"/>
-    <w:rsid w:val="00DF7198"/>
-    <w:rPr>
-      <w:rFonts w:asciiTheme="majorHAnsi" w:eastAsiaTheme="majorEastAsia" w:hAnsiTheme="majorHAnsi" w:cstheme="majorBidi"/>
-      <w:spacing w:val="-10"/>
-      <w:kern w:val="28"/>
-      <w:sz w:val="56"/>
-      <w:szCs w:val="56"/>
-    </w:rPr>
-  </w:style>
-  <w:style w:type="paragraph" w:styleId="Subtitle">
-    <w:name w:val="Subtitle"/>
-    <w:basedOn w:val="Normal"/>
-    <w:next w:val="Normal"/>
-    <w:link w:val="SubtitleChar"/>
-    <w:uiPriority w:val="11"/>
-    <w:qFormat/>
-    <w:rsid w:val="00DF7198"/>
-    <w:pPr>
-      <w:numPr>
-        <w:ilvl w:val="1"/>
-      </w:numPr>
-    </w:pPr>
-    <w:rPr>
-      <w:rFonts w:eastAsiaTheme="majorEastAsia" w:cstheme="majorBidi"/>
-      <w:color w:val="595959" w:themeColor="text1" w:themeTint="A6"/>
-      <w:spacing w:val="15"/>
-      <w:sz w:val="28"/>
-      <w:szCs w:val="28"/>
-    </w:rPr>
-  </w:style>
-  <w:style w:type="character" w:customStyle="1" w:styleId="SubtitleChar">
-    <w:name w:val="Subtitle Char"/>
-    <w:basedOn w:val="DefaultParagraphFont"/>
-    <w:link w:val="Subtitle"/>
-    <w:uiPriority w:val="11"/>
-    <w:rsid w:val="00DF7198"/>
-    <w:rPr>
-      <w:rFonts w:eastAsiaTheme="majorEastAsia" w:cstheme="majorBidi"/>
-      <w:color w:val="595959" w:themeColor="text1" w:themeTint="A6"/>
-      <w:spacing w:val="15"/>
-      <w:sz w:val="28"/>
-      <w:szCs w:val="28"/>
-    </w:rPr>
-  </w:style>
-  <w:style w:type="paragraph" w:styleId="Quote">
-    <w:name w:val="Quote"/>
-    <w:basedOn w:val="Normal"/>
-    <w:next w:val="Normal"/>
-    <w:link w:val="QuoteChar"/>
-    <w:uiPriority w:val="29"/>
-    <w:qFormat/>
-    <w:rsid w:val="00DF7198"/>
-    <w:pPr>
-      <w:spacing w:before="160"/>
-      <w:jc w:val="center"/>
-    </w:pPr>
-    <w:rPr>
-      <w:i/>
-      <w:iCs/>
-      <w:color w:val="404040" w:themeColor="text1" w:themeTint="BF"/>
-    </w:rPr>
-  </w:style>
-  <w:style w:type="character" w:customStyle="1" w:styleId="QuoteChar">
-    <w:name w:val="Quote Char"/>
-    <w:basedOn w:val="DefaultParagraphFont"/>
-    <w:link w:val="Quote"/>
-    <w:uiPriority w:val="29"/>
-    <w:rsid w:val="00DF7198"/>
-    <w:rPr>
-      <w:i/>
-      <w:iCs/>
-      <w:color w:val="404040" w:themeColor="text1" w:themeTint="BF"/>
-    </w:rPr>
-  </w:style>
-  <w:style w:type="paragraph" w:styleId="ListParagraph">
-    <w:name w:val="List Paragraph"/>
-    <w:basedOn w:val="Normal"/>
-    <w:uiPriority w:val="34"/>
-    <w:qFormat/>
-    <w:rsid w:val="00DF7198"/>
-    <w:pPr>
-      <w:ind w:left="720"/>
-      <w:contextualSpacing/>
-    </w:pPr>
-  </w:style>
-  <w:style w:type="character" w:styleId="IntenseEmphasis">
-    <w:name w:val="Intense Emphasis"/>
-    <w:basedOn w:val="DefaultParagraphFont"/>
-    <w:uiPriority w:val="21"/>
-    <w:qFormat/>
-    <w:rsid w:val="00DF7198"/>
-    <w:rPr>
-      <w:i/>
-      <w:iCs/>
-      <w:color w:val="0F4761" w:themeColor="accent1" w:themeShade="BF"/>
-    </w:rPr>
-  </w:style>
-  <w:style w:type="paragraph" w:styleId="IntenseQuote">
-    <w:name w:val="Intense Quote"/>
-    <w:basedOn w:val="Normal"/>
-    <w:next w:val="Normal"/>
-    <w:link w:val="IntenseQuoteChar"/>
-    <w:uiPriority w:val="30"/>
-    <w:qFormat/>
-    <w:rsid w:val="00DF7198"/>
-    <w:pPr>
-      <w:pBdr>
-        <w:top w:val="single" w:sz="4" w:space="10" w:color="0F4761" w:themeColor="accent1" w:themeShade="BF"/>
-        <w:bottom w:val="single" w:sz="4" w:space="10" w:color="0F4761" w:themeColor="accent1" w:themeShade="BF"/>
-      </w:pBdr>
-      <w:spacing w:before="360" w:after="360"/>
-      <w:ind w:left="864" w:right="864"/>
-      <w:jc w:val="center"/>
-    </w:pPr>
-    <w:rPr>
-      <w:i/>
-      <w:iCs/>
-      <w:color w:val="0F4761" w:themeColor="accent1" w:themeShade="BF"/>
-    </w:rPr>
-  </w:style>
-  <w:style w:type="character" w:customStyle="1" w:styleId="IntenseQuoteChar">
-    <w:name w:val="Intense Quote Char"/>
-    <w:basedOn w:val="DefaultParagraphFont"/>
-    <w:link w:val="IntenseQuote"/>
-    <w:uiPriority w:val="30"/>
-    <w:rsid w:val="00DF7198"/>
-    <w:rPr>
-      <w:i/>
-      <w:iCs/>
-      <w:color w:val="0F4761" w:themeColor="accent1" w:themeShade="BF"/>
-    </w:rPr>
-  </w:style>
-  <w:style w:type="character" w:styleId="IntenseReference">
-    <w:name w:val="Intense Reference"/>
-    <w:basedOn w:val="DefaultParagraphFont"/>
-    <w:uiPriority w:val="32"/>
-    <w:qFormat/>
-    <w:rsid w:val="00DF7198"/>
-    <w:rPr>
-      <w:b/>
-      <w:bCs/>
-      <w:smallCaps/>
-      <w:color w:val="0F4761" w:themeColor="accent1" w:themeShade="BF"/>
-      <w:spacing w:val="5"/>
-    </w:rPr>
-  </w:style>
-  <w:style w:type="character" w:styleId="Hyperlink">
-    <w:name w:val="Hyperlink"/>
-    <w:basedOn w:val="DefaultParagraphFont"/>
-    <w:uiPriority w:val="99"/>
-    <w:unhideWhenUsed/>
-    <w:rsid w:val="00DF7198"/>
-    <w:rPr>
-      <w:color w:val="467886" w:themeColor="hyperlink"/>
-      <w:u w:val="single"/>
-    </w:rPr>
-  </w:style>
-  <w:style w:type="character" w:styleId="UnresolvedMention">
-    <w:name w:val="Unresolved Mention"/>
-    <w:basedOn w:val="DefaultParagraphFont"/>
-    <w:uiPriority w:val="99"/>
-    <w:semiHidden/>
-    <w:unhideWhenUsed/>
-    <w:rsid w:val="00DF7198"/>
-    <w:rPr>
-      <w:color w:val="605E5C"/>
-      <w:shd w:val="clear" w:color="auto" w:fill="E1DFDD"/>
-    </w:rPr>
   </w:style>
 </w:styles>
 </file>

</xml_diff>